<commit_message>
Add OpenBIM demo screenshots to awards description
</commit_message>
<xml_diff>
--- a/docs/awards-2026/BIM_AWARDS_2026_STUDENT_RESEARCH_DESCRIPTION.docx
+++ b/docs/awards-2026/BIM_AWARDS_2026_STUDENT_RESEARCH_DESCRIPTION.docx
@@ -388,7 +388,7 @@
           <w:color w:val="0B2545"/>
           <w:sz w:val="20"/>
         </w:rPr>
-        <w:t xml:space="preserve">첫째, 검사 범위를 </w:t>
+        <w:t xml:space="preserve">첫째, scope를 </w:t>
       </w:r>
       <w:r>
         <w:rPr>
@@ -452,7 +452,7 @@
           <w:color w:val="0B2545"/>
           <w:sz w:val="20"/>
         </w:rPr>
-        <w:t xml:space="preserve">로 구분했다. IFC 범위에서는 IFC4, IfcProject, 길이 단위, GlobalId, 공간 containment를 검사한다. IDS 범위에서는 AssetTag, UtilityType, SystemCode, 분류와 필수 속성을 검사한다. 프로젝트 geometry는 직교 box 모델의 world AABB를 사용해 FAB Tool 한쪽에 0.6 m service envelope를 만들고 양의 중첩만 실패로 처리한다. 프로젝트 revision은 </w:t>
+        <w:t xml:space="preserve">로 분리했다. IFC는 schema·project·단위·GlobalId·containment, IDS는 필수 속성과 분류를 검사한다. geometry는 직교 box의 world AABB로 0.6 m service envelope를 만들고, revision은 </w:t>
       </w:r>
       <w:r>
         <w:rPr>
@@ -468,7 +468,7 @@
           <w:color w:val="0B2545"/>
           <w:sz w:val="20"/>
         </w:rPr>
-        <w:t>로 같은 자산을 매칭하고 GlobalId 변화와 locked field의 승인 여부를 검사한다. geometry 누락과 identity 모호성은 PASS가 아니라 사람 확인이 필요한 상태로 분리한다.</w:t>
+        <w:t>로 같은 자산의 GlobalId·locked field 변화를 검사한다. geometry 누락과 identity 모호성은 PASS가 아니라 사람 확인 상태로 남긴다.</w:t>
       </w:r>
     </w:p>
     <w:p>
@@ -478,7 +478,103 @@
           <w:color w:val="0B2545"/>
           <w:sz w:val="20"/>
         </w:rPr>
-        <w:t>둘째, 작성 도구의 성공 메시지가 아니라 실제로 저장된 IFC bytes를 검사한다. baseline, candidate, IDS, profile에 SHA-256을 부여하고 worker가 새로 연 모델에서만 판정한다. 각 issue에는 source hash, rule ID, entity GlobalId 또는 STEP ID, field, expected, actual을 저장한다. 같은 입력의 timestamp와 run ID를 제외한 canonical payload가 반복 실행에서 동일한지도 확인했다.</w:t>
+        <w:t>둘째, 저장된 IFC bytes를 별도 worker에서 다시 열고 baseline·candidate·IDS·profile의 SHA-256을 판정과 연결했다. 각 issue는 rule ID, entity/STEP ID, field, expected/actual과 source hash를 보존하며, timestamp와 run ID를 제외한 canonical payload의 반복 결정성도 확인했다.</w:t>
+      </w:r>
+    </w:p>
+    <w:p>
+      <w:pPr>
+        <w:spacing w:before="60" w:after="20" w:line="240" w:lineRule="auto"/>
+        <w:jc w:val="center"/>
+      </w:pPr>
+      <w:r>
+        <w:drawing>
+          <wp:inline xmlns:a="http://schemas.openxmlformats.org/drawingml/2006/main" xmlns:pic="http://schemas.openxmlformats.org/drawingml/2006/picture">
+            <wp:extent cx="2934000" cy="1405875"/>
+            <wp:docPr id="1" name="Picture 1" descr="그림 1. 기준·후보 IFC와 IDS 입력 세트"/>
+            <wp:cNvGraphicFramePr>
+              <a:graphicFrameLocks noChangeAspect="1"/>
+            </wp:cNvGraphicFramePr>
+            <a:graphic>
+              <a:graphicData uri="http://schemas.openxmlformats.org/drawingml/2006/picture">
+                <pic:pic>
+                  <pic:nvPicPr>
+                    <pic:cNvPr id="0" name="openbim-demo-input.png"/>
+                    <pic:cNvPicPr/>
+                  </pic:nvPicPr>
+                  <pic:blipFill>
+                    <a:blip r:embed="rId15"/>
+                    <a:stretch>
+                      <a:fillRect/>
+                    </a:stretch>
+                  </pic:blipFill>
+                  <pic:spPr>
+                    <a:xfrm>
+                      <a:off x="0" y="0"/>
+                      <a:ext cx="2934000" cy="1405875"/>
+                    </a:xfrm>
+                    <a:prstGeom prst="rect"/>
+                  </pic:spPr>
+                </pic:pic>
+              </a:graphicData>
+            </a:graphic>
+          </wp:inline>
+        </w:drawing>
+      </w:r>
+      <w:r>
+        <w:rPr>
+          <w:rFonts w:ascii="Calibri" w:hAnsi="Calibri" w:eastAsia="Malgun Gothic"/>
+          <w:color w:val="0B2545"/>
+          <w:sz w:val="10"/>
+        </w:rPr>
+        <w:t xml:space="preserve">  </w:t>
+      </w:r>
+      <w:r>
+        <w:drawing>
+          <wp:inline xmlns:a="http://schemas.openxmlformats.org/drawingml/2006/main" xmlns:pic="http://schemas.openxmlformats.org/drawingml/2006/picture">
+            <wp:extent cx="2934000" cy="1648541"/>
+            <wp:docPr id="2" name="Picture 2" descr="그림 2. 실패 판정·규칙별 결과·입력 해시"/>
+            <wp:cNvGraphicFramePr>
+              <a:graphicFrameLocks noChangeAspect="1"/>
+            </wp:cNvGraphicFramePr>
+            <a:graphic>
+              <a:graphicData uri="http://schemas.openxmlformats.org/drawingml/2006/picture">
+                <pic:pic>
+                  <pic:nvPicPr>
+                    <pic:cNvPr id="0" name="openbim-demo-result.png"/>
+                    <pic:cNvPicPr/>
+                  </pic:nvPicPr>
+                  <pic:blipFill>
+                    <a:blip r:embed="rId16"/>
+                    <a:stretch>
+                      <a:fillRect/>
+                    </a:stretch>
+                  </pic:blipFill>
+                  <pic:spPr>
+                    <a:xfrm>
+                      <a:off x="0" y="0"/>
+                      <a:ext cx="2934000" cy="1648541"/>
+                    </a:xfrm>
+                    <a:prstGeom prst="rect"/>
+                  </pic:spPr>
+                </pic:pic>
+              </a:graphicData>
+            </a:graphic>
+          </wp:inline>
+        </w:drawing>
+      </w:r>
+    </w:p>
+    <w:p>
+      <w:pPr>
+        <w:spacing w:before="0" w:after="60" w:line="264" w:lineRule="auto"/>
+        <w:jc w:val="center"/>
+      </w:pPr>
+      <w:r>
+        <w:rPr>
+          <w:rFonts w:ascii="Calibri" w:hAnsi="Calibri" w:eastAsia="Malgun Gothic"/>
+          <w:color w:val="546070"/>
+          <w:sz w:val="16"/>
+        </w:rPr>
+        <w:t>그림 1. 기준·후보 IFC와 IDS 입력 세트  ·  그림 2. 실패 판정·규칙별 결과·입력 해시</w:t>
       </w:r>
     </w:p>
     <w:p>
@@ -488,7 +584,7 @@
           <w:color w:val="0B2545"/>
           <w:sz w:val="20"/>
         </w:rPr>
-        <w:t xml:space="preserve">셋째, 결과를 보고 규칙을 바꾸지 않기 위해 Design Science Research와 통제된 오류주입 평가를 결합했다. </w:t>
+        <w:t xml:space="preserve">셋째, Design Science Research와 통제 오류주입 평가를 결합했다. 실제 기업 자료가 없는 </w:t>
       </w:r>
       <w:r>
         <w:rPr>
@@ -504,7 +600,7 @@
           <w:color w:val="0B2545"/>
           <w:sz w:val="20"/>
         </w:rPr>
-        <w:t>은 실제 기업·FAB 자료를 포함하지 않는 코드 생성 IFC4 dataset이다. 대표 1개, 개발용 pilot 6개, held-out evaluation 30개로 총 37개 case를 구성했다. 세 layout은 각각 32·40·48개 검사 자산을 포함한다. 각 case에는 clean, authorized, faulty, corrected 네 revision과 detector와 분리된 mutation manifest·truth가 있다. faulty candidate마다 서로 다른 객체에 11개 오류를 주입해 held-out evaluation에서 총 330개 primary fault를 평가했다.</w:t>
+        <w:t>은 대표 1, pilot 6, held-out 30의 총 37 case와 32·40·48개 자산 layout으로 구성했다. 각 case에는 clean·authorized·faulty·corrected revision과 독립 manifest·truth가 있고, faulty candidate마다 11개 오류를 주입해 held-out에서 330개 primary fault를 평가했다.</w:t>
       </w:r>
     </w:p>
     <w:p>
@@ -522,7 +618,7 @@
           <w:color w:val="0B2545"/>
           <w:sz w:val="20"/>
         </w:rPr>
-        <w:t xml:space="preserve">generator, detector, mutation manifest와 evaluator를 파일 수준에서 분리하고 pilot과 evaluation seed도 분리했다. 규칙, seed, matching key, metric과 threshold는 결과 확인 전에 </w:t>
+        <w:t xml:space="preserve">generator·detector·manifest·evaluator와 pilot/evaluation seed를 분리했다. 규칙·seed·matching key·metric·threshold는 </w:t>
       </w:r>
       <w:r>
         <w:rPr>
@@ -538,7 +634,7 @@
           <w:color w:val="0B2545"/>
           <w:sz w:val="20"/>
         </w:rPr>
-        <w:t>로 동결했다. IFC를 serialize한 뒤 새 프로세스에서 다시 열었으며, model·IDS·profile· truth·output hash를 보존했다. 각 candidate는 warm-up 후 10회 측정했다.</w:t>
+        <w:t>로 사전 동결했고, 저장 IFC를 새 프로세스에서 열어 hash를 보존하며 candidate마다 warm-up 후 10회 측정했다.</w:t>
       </w:r>
     </w:p>
     <w:p>
@@ -548,7 +644,7 @@
           <w:color w:val="0B2545"/>
           <w:sz w:val="20"/>
         </w:rPr>
-        <w:t xml:space="preserve">동일 evaluation case에서 네 ablation을 비교했다. A는 IDS only, B는 A+IFC integrity, C는 B+geometry, D는 C+revision의 Full pipeline이다. 고정된 330개 primary fault 분모에서 recall은 A 0.454545, B 0.636364, C 0.818182, D 1.000000이었고, 각 계층 추가 기여는 </w:t>
+        <w:t xml:space="preserve">330개 고정 분모의 ablation recall은 IDS(A) 0.454545 → +IFC(B) 0.636364 → +geometry(C) 0.818182 → +revision(D) 1.000000으로, 각 scope의 추가 기여는 </w:t>
       </w:r>
       <w:r>
         <w:rPr>
@@ -564,7 +660,7 @@
           <w:color w:val="0B2545"/>
           <w:sz w:val="20"/>
         </w:rPr>
-        <w:t>이었다. 이는 IDS가 형상과 revision을 검사했다는 뜻이 아니라 서로 다른 scope의 규칙을 순차적으로 결합했을 때의 추가 검출량을 나타낸다.</w:t>
+        <w:t>이었다.</w:t>
       </w:r>
     </w:p>
     <w:p>

</xml_diff>